<commit_message>
fix: strictly separate references (Duolingo & Brilliant) from pedagogical methodology
</commit_message>
<xml_diff>
--- a/SPEAKER_GUIDE.docx
+++ b/SPEAKER_GUIDE.docx
@@ -11,7 +11,6 @@
         <w:rPr>
           <w:rFonts w:ascii="Arial" w:hAnsi="Arial"/>
           <w:b/>
-          <w:color w:val="000000"/>
           <w:sz w:val="44"/>
         </w:rPr>
         <w:t>ИМБА: ТЕЗИСНЫЙ ПЛАН И ШПАРГАЛКА К ЗАЩИТЕ</w:t>
@@ -29,7 +28,7 @@
           <w:color w:val="646464"/>
           <w:sz w:val="26"/>
         </w:rPr>
-        <w:t>Структура выступления по 16 слайдам, ключевые артефакты и данные для формы портфолио</w:t>
+        <w:t>Структура выступления по 16 слайдам, артефакты и точные данные для portfolio.hse.ru</w:t>
       </w:r>
     </w:p>
     <w:p>
@@ -40,7 +39,6 @@
         <w:rPr>
           <w:rFonts w:ascii="Arial" w:hAnsi="Arial"/>
           <w:b/>
-          <w:color w:val="000000"/>
           <w:sz w:val="30"/>
         </w:rPr>
         <w:t>1. ТОЧНЫЕ ДАННЫЕ ДЛЯ ЗАПОЛНЕНИЯ ФОРМЫ (PORTFOLIO.HSE.RU)</w:t>
@@ -113,7 +111,7 @@
           <w:i/>
           <w:sz w:val="21"/>
         </w:rPr>
-        <w:t>«ИМБА — образовательный веб-тренажер для подготовки к ОГЭ по математике через разбор скрытых алгоритмов видеоигр (лутбоксы, крафт, рейды). Проект выполнен в эстетике нео-брутализма с контрастной функциональной палитрой. Методология опирается на референсы Duolingo (геймификация и путь прогресса) и Brilliant (интерактивные симуляции). Включает 12 интерактивных уровней и веб-прототип.»</w:t>
+        <w:t>«ИМБА — образовательный веб-тренажер для подготовки к ОГЭ по математике через разбор скрытых алгоритмов видеоигр (лутбоксы, крафт, рейды). Проект выполнен в эстетике нео-брутализма. В основе методики — игровой реверс-инжиниринг и деятельностное обучение. В качестве продуктовых референсов взяты Duolingo (геймификация) и Brilliant (интерактивные симуляции). Включает 12 модулей и веб-прототип.»</w:t>
       </w:r>
     </w:p>
     <w:p>
@@ -127,7 +125,7 @@
           <w:i w:val="0"/>
           <w:sz w:val="21"/>
         </w:rPr>
-        <w:t>Длина текста: ровно 388 символов (включая пробелы) — строго попадает в лимит 200–400 символов.</w:t>
+        <w:t>Длина текста: ровно 392 символа (включая пробелы) — строго попадает в лимит 200–400 символов.</w:t>
       </w:r>
     </w:p>
     <w:p>
@@ -229,7 +227,6 @@
         <w:rPr>
           <w:rFonts w:ascii="Arial" w:hAnsi="Arial"/>
           <w:b/>
-          <w:color w:val="000000"/>
           <w:sz w:val="30"/>
         </w:rPr>
         <w:t>2. ТЕЗИСНЫЙ ПЛАН ЗАЩИТЫ ПО СЛАЙДАМ (16 СЛАЙДОВ)</w:t>
@@ -295,14 +292,14 @@
           <w:b/>
           <w:sz w:val="21"/>
         </w:rPr>
-        <w:t xml:space="preserve">Референсы: </w:t>
+        <w:t xml:space="preserve">Продуктовые референсы: </w:t>
       </w:r>
       <w:r>
         <w:rPr>
           <w:rFonts w:ascii="Arial" w:hAnsi="Arial"/>
           <w:sz w:val="21"/>
         </w:rPr>
-        <w:t>Duolingo (геймификация и трекинг) и Brilliant (интерактивные визуальные симуляторы).</w:t>
+        <w:t>Duolingo (геймификация и трек прогресса) и Brilliant (визуальные интерактивные симуляторы).</w:t>
       </w:r>
     </w:p>
     <w:p>
@@ -316,7 +313,7 @@
           <w:b/>
           <w:sz w:val="21"/>
         </w:rPr>
-        <w:t xml:space="preserve">Масштаб: </w:t>
+        <w:t xml:space="preserve">Масштаб курса: </w:t>
       </w:r>
       <w:r>
         <w:rPr>
@@ -442,7 +439,7 @@
           <w:i/>
           <w:sz w:val="21"/>
         </w:rPr>
-        <w:t>Что показывать / Артефакт: Инфографика трех узловых проблем (стресс, игровой парадокс, финансовая неграмотность).</w:t>
+        <w:t>Что показывать / Артефакт: Инфографика трех узловых проблем (стресс, игровой парадокс, финансовая уязвимость).</w:t>
       </w:r>
     </w:p>
     <w:p>
@@ -456,7 +453,7 @@
           <w:color w:val="00873D"/>
           <w:sz w:val="24"/>
         </w:rPr>
-        <w:t>СЛАЙД 03: Референсы и методология</w:t>
+        <w:t>СЛАЙД 03: Продуктовые референсы</w:t>
       </w:r>
     </w:p>
     <w:p>
@@ -470,7 +467,7 @@
           <w:i w:val="0"/>
           <w:sz w:val="21"/>
         </w:rPr>
-        <w:t>Главный тезис: Синтез лучших мировых практик Duolingo и Brilliant в нео-бруталистской эстетике.</w:t>
+        <w:t>Главный тезис: Анализ лучших мировых практик EdTech: геймификация Duolingo и визуальные симуляции Brilliant.</w:t>
       </w:r>
     </w:p>
     <w:p>
@@ -484,7 +481,7 @@
           <w:b/>
           <w:sz w:val="21"/>
         </w:rPr>
-        <w:t xml:space="preserve">Duolingo: </w:t>
+        <w:t xml:space="preserve">Референс Duolingo: </w:t>
       </w:r>
       <w:r>
         <w:rPr>
@@ -505,14 +502,14 @@
           <w:b/>
           <w:sz w:val="21"/>
         </w:rPr>
-        <w:t xml:space="preserve">Brilliant: </w:t>
+        <w:t xml:space="preserve">Референс Brilliant: </w:t>
       </w:r>
       <w:r>
         <w:rPr>
           <w:rFonts w:ascii="Arial" w:hAnsi="Arial"/>
           <w:sz w:val="21"/>
         </w:rPr>
-        <w:t>Отказ от пассивных видеолекций — обучение через интерактивные ползунки и наблюдение законов на лету.</w:t>
+        <w:t>Отказ от пассивных видеолекций — обучение через интерактивные стенды с прямым манипулированием объектами.</w:t>
       </w:r>
     </w:p>
     <w:p>
@@ -533,7 +530,7 @@
           <w:rFonts w:ascii="Arial" w:hAnsi="Arial"/>
           <w:sz w:val="21"/>
         </w:rPr>
-        <w:t>Высокий контраст, черные рамки 8px, функциональная цветовая кодировка без лишнего шума.</w:t>
+        <w:t>Высокий контраст, черные рамки 8px, жесткие тени 18px, функциональная цветовая кодировка без лишнего шума.</w:t>
       </w:r>
     </w:p>
     <w:p>
@@ -547,7 +544,7 @@
           <w:i/>
           <w:sz w:val="21"/>
         </w:rPr>
-        <w:t>Что показывать / Артефакт: Карточки методологического переноса механик Duolingo и Brilliant в образовательный продукт.</w:t>
+        <w:t>Что показывать / Артефакт: Карточки продуктового анализа механик Duolingo и Brilliant.</w:t>
       </w:r>
     </w:p>
     <w:p>
@@ -1149,7 +1146,7 @@
           <w:color w:val="00873D"/>
           <w:sz w:val="24"/>
         </w:rPr>
-        <w:t>СЛАЙД 09: Педагогический цикл урока</w:t>
+        <w:t>СЛАЙД 09: Педагогическая методология</w:t>
       </w:r>
     </w:p>
     <w:p>
@@ -1163,7 +1160,7 @@
           <w:i w:val="0"/>
           <w:sz w:val="21"/>
         </w:rPr>
-        <w:t>Главный тезис: 4-шаговый сценарий каждого модуля: от игрового азарта к безошибочному решению ОГЭ.</w:t>
+        <w:t>Главный тезис: Методология: игровой реверс-инжиниринг и 4-шаговый цикл деятельностного обучения.</w:t>
       </w:r>
     </w:p>
     <w:p>
@@ -1198,7 +1195,7 @@
           <w:b/>
           <w:sz w:val="21"/>
         </w:rPr>
-        <w:t xml:space="preserve">Шаг 2 (Стекло / Модель): </w:t>
+        <w:t xml:space="preserve">Шаг 2 (Деконструкция / Модель): </w:t>
       </w:r>
       <w:r>
         <w:rPr>
@@ -1219,7 +1216,7 @@
           <w:b/>
           <w:sz w:val="21"/>
         </w:rPr>
-        <w:t xml:space="preserve">Шаг 3 (Действие / Симулятор): </w:t>
+        <w:t xml:space="preserve">Шаг 3 (Действие / Эксперимент): </w:t>
       </w:r>
       <w:r>
         <w:rPr>
@@ -1240,7 +1237,7 @@
           <w:b/>
           <w:sz w:val="21"/>
         </w:rPr>
-        <w:t xml:space="preserve">Шаг 4 (Закрепление / ОГЭ): </w:t>
+        <w:t xml:space="preserve">Шаг 4 (Валидация / ОГЭ): </w:t>
       </w:r>
       <w:r>
         <w:rPr>
@@ -1261,7 +1258,7 @@
           <w:i/>
           <w:sz w:val="21"/>
         </w:rPr>
-        <w:t>Что показывать / Артефакт: Схема 4 тактов урока (Опыт → Формула → Симулятор → ОГЭ).</w:t>
+        <w:t>Что показывать / Артефакт: Схема 4 тактов деятельностного цикла (Опыт → Деконструкция → Эксперимент → Валидация).</w:t>
       </w:r>
     </w:p>
     <w:p>
@@ -1429,14 +1426,14 @@
           <w:b/>
           <w:sz w:val="21"/>
         </w:rPr>
-        <w:t xml:space="preserve">Навигация и прогресс: </w:t>
+        <w:t xml:space="preserve">Интерфейс карты: </w:t>
       </w:r>
       <w:r>
         <w:rPr>
           <w:rFonts w:ascii="Arial" w:hAnsi="Arial"/>
           <w:sz w:val="21"/>
         </w:rPr>
-        <w:t>Изометрический трек с замками, индикатор оставшихся шагов («Шаг 2 из 4») и легкий возврат на карту.</w:t>
+        <w:t>Изометрический трек с замками (референс Duolingo), индикатор оставшихся шагов и легкий возврат на карту.</w:t>
       </w:r>
     </w:p>
     <w:p>
@@ -1471,7 +1468,7 @@
           <w:i/>
           <w:sz w:val="21"/>
         </w:rPr>
-        <w:t>Что показывать / Артефакт: Интерфейсные элементы: карта Duolingo, скретч-полотно на HTML5 Canvas, плашки баланса.</w:t>
+        <w:t>Что показывать / Артефакт: Интерфейсные элементы: карта курса, скретч-полотно на HTML5 Canvas, плашки баланса.</w:t>
       </w:r>
     </w:p>
     <w:p>
@@ -2003,7 +2000,7 @@
           <w:rFonts w:ascii="Arial" w:hAnsi="Arial"/>
           <w:sz w:val="21"/>
         </w:rPr>
-        <w:t>Все 12 интерактивных уровней, карта Duolingo, симуляторы Brilliant, сундуки и тесты ОГЭ.</w:t>
+        <w:t>Все 12 интерактивных уровней, карта прогресса, визуальные симуляторы, сундуки и тесты ОГЭ.</w:t>
       </w:r>
     </w:p>
     <w:p>

</xml_diff>

<commit_message>
docs: add 400-char portfolio annotation covering all required rubrics
</commit_message>
<xml_diff>
--- a/SPEAKER_GUIDE.docx
+++ b/SPEAKER_GUIDE.docx
@@ -105,13 +105,7 @@
         <w:spacing w:after="80"/>
       </w:pPr>
       <w:r>
-        <w:rPr>
-          <w:rFonts w:ascii="Arial" w:hAnsi="Arial"/>
-          <w:b w:val="0"/>
-          <w:i/>
-          <w:sz w:val="21"/>
-        </w:rPr>
-        <w:t>«ИМБА — образовательный веб-тренажер для подготовки к ОГЭ по математике через разбор скрытых алгоритмов видеоигр (лутбоксы, крафт, рейды). Проект выполнен в эстетике нео-брутализма. В основе методики — игровой реверс-инжиниринг и деятельностное обучение. В качестве продуктовых референсов взяты Duolingo (геймификация) и Brilliant (интерактивные симуляции). Включает 12 модулей и веб-прототип.»</w:t>
+        <w:t>«Курс «ИМБА» — асинхронный онлайн-тренажер ОГЭ по математике для подростков 13–15 лет. Входные требования: база 6 класса. УТП: реверс-инжиниринг игр вместо зубрежки. Формат: 12 уроков по 15 мин онлайн в браузере. Чему научатся и практика: интерактивные симуляторы и тесты ОГЭ. Тематический план: 3 раздела (Микроэкономика, Макроэкономика, Физика меты), 12 уровней с открытым прототипом.»</w:t>
       </w:r>
     </w:p>
     <w:p>
@@ -119,13 +113,7 @@
         <w:spacing w:after="80"/>
       </w:pPr>
       <w:r>
-        <w:rPr>
-          <w:rFonts w:ascii="Arial" w:hAnsi="Arial"/>
-          <w:b/>
-          <w:i w:val="0"/>
-          <w:sz w:val="21"/>
-        </w:rPr>
-        <w:t>Длина текста: ровно 392 символа (включая пробелы) — строго попадает в лимит 200–400 символов.</w:t>
+        <w:t>Длина текста: ровно 385 символов (включая пробелы) — строго попадает в лимит 200–400 символов и содержит все обязательные пункты.</w:t>
       </w:r>
     </w:p>
     <w:p>

</xml_diff>

<commit_message>
fix: remove references from footers, frame world experience and proprietary dev on dedicated slide
</commit_message>
<xml_diff>
--- a/SPEAKER_GUIDE.docx
+++ b/SPEAKER_GUIDE.docx
@@ -105,7 +105,13 @@
         <w:spacing w:after="80"/>
       </w:pPr>
       <w:r>
-        <w:t>«Курс «ИМБА» — асинхронный онлайн-тренажер ОГЭ по математике для подростков 13–15 лет. Входные требования: база 6 класса. УТП: реверс-инжиниринг игр вместо зубрежки. Формат: 12 уроков по 15 мин онлайн в браузере. Чему научатся и практика: интерактивные симуляторы и тесты ОГЭ. Тематический план: 3 раздела (Микроэкономика, Макроэкономика, Физика меты), 12 уровней с открытым прототипом.»</w:t>
+        <w:rPr>
+          <w:rFonts w:ascii="Arial" w:hAnsi="Arial"/>
+          <w:b w:val="0"/>
+          <w:i/>
+          <w:sz w:val="21"/>
+        </w:rPr>
+        <w:t>«ИМБА — образовательный веб-тренажер для подготовки к ОГЭ по математике через разбор скрытых алгоритмов видеоигр (лутбоксы, крафт, рейды). Проект выполнен в эстетике нео-брутализма. В основе методики — игровой реверс-инжиниринг и деятельностное обучение. В качестве продуктовых референсов взяты Duolingo (геймификация) и Brilliant (интерактивные симуляции). Включает 12 модулей и веб-прототип.»</w:t>
       </w:r>
     </w:p>
     <w:p>
@@ -113,7 +119,13 @@
         <w:spacing w:after="80"/>
       </w:pPr>
       <w:r>
-        <w:t>Длина текста: ровно 385 символов (включая пробелы) — строго попадает в лимит 200–400 символов и содержит все обязательные пункты.</w:t>
+        <w:rPr>
+          <w:rFonts w:ascii="Arial" w:hAnsi="Arial"/>
+          <w:b/>
+          <w:i w:val="0"/>
+          <w:sz w:val="21"/>
+        </w:rPr>
+        <w:t>Длина текста: ровно 392 символа (включая пробелы) — строго попадает в лимит 200–400 символов.</w:t>
       </w:r>
     </w:p>
     <w:p>
@@ -441,7 +453,7 @@
           <w:color w:val="00873D"/>
           <w:sz w:val="24"/>
         </w:rPr>
-        <w:t>СЛАЙД 03: Продуктовые референсы</w:t>
+        <w:t>СЛАЙД 03: Мировой опыт и наша доработка</w:t>
       </w:r>
     </w:p>
     <w:p>
@@ -455,7 +467,7 @@
           <w:i w:val="0"/>
           <w:sz w:val="21"/>
         </w:rPr>
-        <w:t>Главный тезис: Анализ лучших мировых практик EdTech: геймификация Duolingo и визуальные симуляции Brilliant.</w:t>
+        <w:t>Главный тезис: Опираемся на доказанные практики лидеров EdTech (Duolingo и Brilliant) и дорабатываем их под гейминг и требования экзамена.</w:t>
       </w:r>
     </w:p>
     <w:p>
@@ -469,14 +481,14 @@
           <w:b/>
           <w:sz w:val="21"/>
         </w:rPr>
-        <w:t xml:space="preserve">Референс Duolingo: </w:t>
+        <w:t xml:space="preserve">Мировой опыт (Duolingo &amp; Brilliant): </w:t>
       </w:r>
       <w:r>
         <w:rPr>
           <w:rFonts w:ascii="Arial" w:hAnsi="Arial"/>
           <w:sz w:val="21"/>
         </w:rPr>
-        <w:t>Изометрический трек прогресса, последовательное открытие уровней замками, раздельные валюты XP и Кристаллы.</w:t>
+        <w:t>Взяли проверенные паттерны коллег: пошаговый трек прогресса и 15-минутные микросессии (удержание внимания), интерактивные стенды с ползунками (исследовательское обучение вместо лекций).</w:t>
       </w:r>
     </w:p>
     <w:p>
@@ -490,14 +502,14 @@
           <w:b/>
           <w:sz w:val="21"/>
         </w:rPr>
-        <w:t xml:space="preserve">Референс Brilliant: </w:t>
+        <w:t xml:space="preserve">Наша доработка (Реальный геймдев): </w:t>
       </w:r>
       <w:r>
         <w:rPr>
           <w:rFonts w:ascii="Arial" w:hAnsi="Arial"/>
           <w:sz w:val="21"/>
         </w:rPr>
-        <w:t>Отказ от пассивных видеолекций — обучение через интерактивные стенды с прямым манипулированием объектами.</w:t>
+        <w:t>Вместо абстрактных упражнений — реверс-инжиниринг любимых игр (CS2, Brawl Stars, Genshin), создающий органическую мотивацию разобраться в математике.</w:t>
       </w:r>
     </w:p>
     <w:p>
@@ -511,14 +523,14 @@
           <w:b/>
           <w:sz w:val="21"/>
         </w:rPr>
-        <w:t xml:space="preserve">Стиль Neobrutalism: </w:t>
+        <w:t xml:space="preserve">Связка с ОГЭ и автономность: </w:t>
       </w:r>
       <w:r>
         <w:rPr>
           <w:rFonts w:ascii="Arial" w:hAnsi="Arial"/>
           <w:sz w:val="21"/>
         </w:rPr>
-        <w:t>Высокий контраст, черные рамки 8px, жесткие тени 18px, функциональная цветовая кодировка без лишнего шума.</w:t>
+        <w:t>Каждый симулятор точно выводит на решение заданий экзамена ОГЭ; весь интерактив работает на клиенте в браузере без серверов и абонентской платы.</w:t>
       </w:r>
     </w:p>
     <w:p>
@@ -532,7 +544,7 @@
           <w:i/>
           <w:sz w:val="21"/>
         </w:rPr>
-        <w:t>Что показывать / Артефакт: Карточки продуктового анализа механик Duolingo и Brilliant.</w:t>
+        <w:t>Что показывать / Артефакт: Инфографика: верхний ярус — индустриальные паттерны лидеров, нижний ярус — три вектора нашей доработки.</w:t>
       </w:r>
     </w:p>
     <w:p>

</xml_diff>